<commit_message>
React architecture context Redux
</commit_message>
<xml_diff>
--- a/Day14 바닐라 코딩을 React로 옮겨 보자.docx
+++ b/Day14 바닐라 코딩을 React로 옮겨 보자.docx
@@ -4,12 +4,10 @@
   <w:body>
     <w:p/>
     <w:p>
-      <w:pPr>
-        <w:rPr>
-          <w:rFonts w:hint="eastAsia"/>
-        </w:rPr>
-      </w:pPr>
-      <w:r>
+      <w:r>
+        <w:rPr>
+          <w:noProof/>
+        </w:rPr>
         <w:drawing>
           <wp:anchor distT="0" distB="0" distL="114300" distR="114300" simplePos="0" relativeHeight="251658240" behindDoc="0" locked="0" layoutInCell="1" allowOverlap="1" wp14:anchorId="253076D3" wp14:editId="702AD714">
             <wp:simplePos x="0" y="0"/>
@@ -34,7 +32,7 @@
                     <pic:cNvPicPr/>
                   </pic:nvPicPr>
                   <pic:blipFill>
-                    <a:blip r:embed="rId4">
+                    <a:blip r:embed="rId5">
                       <a:extLst>
                         <a:ext uri="{28A0092B-C50C-407E-A947-70E740481C1C}">
                           <a14:useLocalDpi xmlns:a14="http://schemas.microsoft.com/office/drawing/2010/main" val="0"/>
@@ -67,6 +65,521 @@
         <w:t>Day14 바닐라 코딩을 React로 옮겨 보자.</w:t>
       </w:r>
     </w:p>
+    <w:p/>
+    <w:p>
+      <w:r>
+        <w:rPr>
+          <w:b/>
+          <w:bCs/>
+        </w:rPr>
+        <w:t>[</w:t>
+      </w:r>
+      <w:r>
+        <w:t>과제 수행 단계</w:t>
+      </w:r>
+      <w:r>
+        <w:rPr>
+          <w:b/>
+          <w:bCs/>
+        </w:rPr>
+        <w:t xml:space="preserve">] </w:t>
+      </w:r>
+    </w:p>
+    <w:p>
+      <w:r>
+        <w:t>단계</w:t>
+      </w:r>
+      <w:r>
+        <w:rPr>
+          <w:b/>
+          <w:bCs/>
+        </w:rPr>
+        <w:t xml:space="preserve">1. Design Thinking </w:t>
+      </w:r>
+    </w:p>
+    <w:p>
+      <w:pPr>
+        <w:rPr>
+          <w:rFonts w:hint="eastAsia"/>
+        </w:rPr>
+      </w:pPr>
+      <w:r>
+        <w:t xml:space="preserve">사용자 입장에서 문제를 </w:t>
+      </w:r>
+      <w:proofErr w:type="spellStart"/>
+      <w:r>
+        <w:t>분석하시오</w:t>
+      </w:r>
+      <w:proofErr w:type="spellEnd"/>
+      <w:r>
+        <w:t>.</w:t>
+      </w:r>
+    </w:p>
+    <w:p>
+      <w:r>
+        <w:t xml:space="preserve">다음 질문에 </w:t>
+      </w:r>
+      <w:proofErr w:type="spellStart"/>
+      <w:r>
+        <w:t>답하시오</w:t>
+      </w:r>
+      <w:proofErr w:type="spellEnd"/>
+      <w:r>
+        <w:t xml:space="preserve">. </w:t>
+      </w:r>
+    </w:p>
+    <w:p>
+      <w:r>
+        <w:t xml:space="preserve">① 사용자는 어떤 불편함을 가지고 있는가? </w:t>
+      </w:r>
+    </w:p>
+    <w:p>
+      <w:pPr>
+        <w:ind w:firstLineChars="200" w:firstLine="440"/>
+      </w:pPr>
+      <w:r>
+        <w:rPr>
+          <w:rFonts w:hint="eastAsia"/>
+        </w:rPr>
+        <w:t xml:space="preserve">분석1] 게시판의 한 페이지에 보여지는 숫자가 고정되어 있음. </w:t>
+      </w:r>
+    </w:p>
+    <w:p>
+      <w:pPr>
+        <w:ind w:firstLineChars="200" w:firstLine="440"/>
+      </w:pPr>
+      <w:r>
+        <w:rPr>
+          <w:rFonts w:hint="eastAsia"/>
+        </w:rPr>
+        <w:t xml:space="preserve">분석2] 같은 이름의 항목이 자유게시판의 영역과 게시판 위에 또다른 공간을 통해 </w:t>
+      </w:r>
+    </w:p>
+    <w:p>
+      <w:pPr>
+        <w:ind w:firstLineChars="200" w:firstLine="440"/>
+      </w:pPr>
+      <w:r>
+        <w:rPr>
+          <w:rFonts w:hint="eastAsia"/>
+        </w:rPr>
+        <w:t xml:space="preserve">      표시되고 있음. </w:t>
+      </w:r>
+    </w:p>
+    <w:p>
+      <w:pPr>
+        <w:pStyle w:val="a6"/>
+        <w:numPr>
+          <w:ilvl w:val="0"/>
+          <w:numId w:val="1"/>
+        </w:numPr>
+      </w:pPr>
+      <w:r>
+        <w:rPr>
+          <w:rFonts w:hint="eastAsia"/>
+        </w:rPr>
+        <w:t xml:space="preserve">페이지 간의 데이터 핸들링에 있어 복잡성이 예상됨. </w:t>
+      </w:r>
+    </w:p>
+    <w:p>
+      <w:pPr>
+        <w:ind w:left="1100" w:hangingChars="500" w:hanging="1100"/>
+      </w:pPr>
+      <w:r>
+        <w:rPr>
+          <w:rFonts w:hint="eastAsia"/>
+        </w:rPr>
+        <w:t xml:space="preserve">    분석3] 검색창이 게시판과 분리가 되어 있어 게시글의 </w:t>
+      </w:r>
+      <w:proofErr w:type="spellStart"/>
+      <w:r>
+        <w:rPr>
+          <w:rFonts w:hint="eastAsia"/>
+        </w:rPr>
+        <w:t>검색창인지</w:t>
+      </w:r>
+      <w:proofErr w:type="spellEnd"/>
+      <w:r>
+        <w:rPr>
+          <w:rFonts w:hint="eastAsia"/>
+        </w:rPr>
+        <w:t xml:space="preserve"> 아니면 일반 </w:t>
+      </w:r>
+      <w:proofErr w:type="spellStart"/>
+      <w:r>
+        <w:rPr>
+          <w:rFonts w:hint="eastAsia"/>
+        </w:rPr>
+        <w:t>검색창인지에</w:t>
+      </w:r>
+      <w:proofErr w:type="spellEnd"/>
+      <w:r>
+        <w:rPr>
+          <w:rFonts w:hint="eastAsia"/>
+        </w:rPr>
+        <w:t xml:space="preserve"> 대한 차별화가 떨어져 보임</w:t>
+      </w:r>
+    </w:p>
+    <w:p>
+      <w:pPr>
+        <w:ind w:left="1100" w:hangingChars="500" w:hanging="1100"/>
+      </w:pPr>
+    </w:p>
+    <w:p>
+      <w:pPr>
+        <w:ind w:left="1100" w:hangingChars="500" w:hanging="1100"/>
+      </w:pPr>
+      <w:r>
+        <w:rPr>
+          <w:rFonts w:hint="eastAsia"/>
+        </w:rPr>
+        <w:lastRenderedPageBreak/>
+        <w:t xml:space="preserve">    분석4] 인기 게시글이 오른쪽 하단에 낮은 비율의 영역을 차지하여 </w:t>
+      </w:r>
+      <w:r>
+        <w:t>“</w:t>
+      </w:r>
+      <w:r>
+        <w:rPr>
+          <w:rFonts w:hint="eastAsia"/>
+        </w:rPr>
+        <w:t>인기</w:t>
+      </w:r>
+      <w:r>
+        <w:t>”</w:t>
+      </w:r>
+      <w:proofErr w:type="spellStart"/>
+      <w:r>
+        <w:rPr>
+          <w:rFonts w:hint="eastAsia"/>
+        </w:rPr>
+        <w:t>라고</w:t>
+      </w:r>
+      <w:proofErr w:type="spellEnd"/>
+      <w:r>
+        <w:rPr>
+          <w:rFonts w:hint="eastAsia"/>
+        </w:rPr>
+        <w:t xml:space="preserve"> 하지만 사람들이 </w:t>
+      </w:r>
+      <w:r>
+        <w:t>“</w:t>
+      </w:r>
+      <w:r>
+        <w:rPr>
+          <w:rFonts w:hint="eastAsia"/>
+        </w:rPr>
+        <w:t>인기</w:t>
+      </w:r>
+      <w:r>
+        <w:t>”</w:t>
+      </w:r>
+      <w:r>
+        <w:rPr>
+          <w:rFonts w:hint="eastAsia"/>
+        </w:rPr>
+        <w:t xml:space="preserve">만큼 관심을 갖기 힘들어 보임. </w:t>
+      </w:r>
+    </w:p>
+    <w:p>
+      <w:pPr>
+        <w:ind w:left="1100" w:hangingChars="500" w:hanging="1100"/>
+        <w:rPr>
+          <w:rFonts w:hint="eastAsia"/>
+        </w:rPr>
+      </w:pPr>
+      <w:r>
+        <w:rPr>
+          <w:rFonts w:hint="eastAsia"/>
+        </w:rPr>
+        <w:t xml:space="preserve">    분석5] 게시판이 주가 되는 페이지인데 </w:t>
+      </w:r>
+      <w:proofErr w:type="spellStart"/>
+      <w:r>
+        <w:rPr>
+          <w:rFonts w:hint="eastAsia"/>
+        </w:rPr>
+        <w:t>카타고리가</w:t>
+      </w:r>
+      <w:proofErr w:type="spellEnd"/>
+      <w:r>
+        <w:rPr>
+          <w:rFonts w:hint="eastAsia"/>
+        </w:rPr>
+        <w:t xml:space="preserve"> 너무 작게 </w:t>
+      </w:r>
+      <w:proofErr w:type="spellStart"/>
+      <w:r>
+        <w:rPr>
+          <w:rFonts w:hint="eastAsia"/>
+        </w:rPr>
+        <w:t>보여짐으로</w:t>
+      </w:r>
+      <w:proofErr w:type="spellEnd"/>
+      <w:r>
+        <w:rPr>
+          <w:rFonts w:hint="eastAsia"/>
+        </w:rPr>
+        <w:t xml:space="preserve"> 인해 </w:t>
+      </w:r>
+      <w:proofErr w:type="spellStart"/>
+      <w:r>
+        <w:rPr>
+          <w:rFonts w:hint="eastAsia"/>
+        </w:rPr>
+        <w:t>카타고리의</w:t>
+      </w:r>
+      <w:proofErr w:type="spellEnd"/>
+      <w:r>
+        <w:rPr>
+          <w:rFonts w:hint="eastAsia"/>
+        </w:rPr>
+        <w:t xml:space="preserve"> 사용보다는 게시판의 용도로 주로 </w:t>
+      </w:r>
+      <w:proofErr w:type="spellStart"/>
+      <w:r>
+        <w:rPr>
+          <w:rFonts w:hint="eastAsia"/>
+        </w:rPr>
+        <w:t>사용될것으로</w:t>
+      </w:r>
+      <w:proofErr w:type="spellEnd"/>
+      <w:r>
+        <w:rPr>
+          <w:rFonts w:hint="eastAsia"/>
+        </w:rPr>
+        <w:t xml:space="preserve"> 예상이 됨. </w:t>
+      </w:r>
+    </w:p>
+    <w:p>
+      <w:pPr>
+        <w:rPr>
+          <w:rFonts w:hint="eastAsia"/>
+        </w:rPr>
+      </w:pPr>
+      <w:r>
+        <w:rPr>
+          <w:rFonts w:hint="eastAsia"/>
+        </w:rPr>
+        <w:t xml:space="preserve">  </w:t>
+      </w:r>
+    </w:p>
+    <w:p>
+      <w:r>
+        <w:t xml:space="preserve">② 이 서비스를 사용하면 어떤 점이 </w:t>
+      </w:r>
+      <w:proofErr w:type="spellStart"/>
+      <w:r>
+        <w:t>편리해지는가</w:t>
+      </w:r>
+      <w:proofErr w:type="spellEnd"/>
+      <w:r>
+        <w:t xml:space="preserve">? </w:t>
+      </w:r>
+    </w:p>
+    <w:p>
+      <w:r>
+        <w:rPr>
+          <w:rFonts w:hint="eastAsia"/>
+        </w:rPr>
+        <w:t xml:space="preserve">     분석 1] </w:t>
+      </w:r>
+      <w:r>
+        <w:rPr>
+          <w:rFonts w:hint="eastAsia"/>
+        </w:rPr>
+        <w:t>게시글의 내용이 가장 넓은 영역을 차지하기에 글을 읽는데 좋을 듯함.</w:t>
+      </w:r>
+    </w:p>
+    <w:p>
+      <w:r>
+        <w:rPr>
+          <w:rFonts w:hint="eastAsia"/>
+        </w:rPr>
+        <w:t xml:space="preserve">     분석 2] 큰 글씨로 조회수 </w:t>
+      </w:r>
+      <w:proofErr w:type="spellStart"/>
+      <w:r>
+        <w:rPr>
+          <w:rFonts w:hint="eastAsia"/>
+        </w:rPr>
+        <w:t>전체게시글</w:t>
+      </w:r>
+      <w:proofErr w:type="spellEnd"/>
+      <w:r>
+        <w:rPr>
+          <w:rFonts w:hint="eastAsia"/>
+        </w:rPr>
+        <w:t xml:space="preserve"> </w:t>
+      </w:r>
+      <w:proofErr w:type="spellStart"/>
+      <w:r>
+        <w:rPr>
+          <w:rFonts w:hint="eastAsia"/>
+        </w:rPr>
+        <w:t>즐겨찾치</w:t>
+      </w:r>
+      <w:proofErr w:type="spellEnd"/>
+      <w:r>
+        <w:rPr>
+          <w:rFonts w:hint="eastAsia"/>
+        </w:rPr>
+        <w:t xml:space="preserve"> </w:t>
+      </w:r>
+      <w:proofErr w:type="spellStart"/>
+      <w:r>
+        <w:rPr>
+          <w:rFonts w:hint="eastAsia"/>
+        </w:rPr>
+        <w:t>내가작성한</w:t>
+      </w:r>
+      <w:proofErr w:type="spellEnd"/>
+      <w:r>
+        <w:rPr>
+          <w:rFonts w:hint="eastAsia"/>
+        </w:rPr>
+        <w:t xml:space="preserve"> 글을 보여주기에 </w:t>
+      </w:r>
+    </w:p>
+    <w:p>
+      <w:pPr>
+        <w:rPr>
+          <w:rFonts w:hint="eastAsia"/>
+        </w:rPr>
+      </w:pPr>
+      <w:r>
+        <w:rPr>
+          <w:rFonts w:hint="eastAsia"/>
+        </w:rPr>
+        <w:t xml:space="preserve">            해당 페이지의 사용빈도 수를 보기 쉽다.  </w:t>
+      </w:r>
+    </w:p>
+    <w:p>
+      <w:r>
+        <w:t>③ 사람들이 가장 많이 사용하는 기능은 무엇일까?</w:t>
+      </w:r>
+    </w:p>
+    <w:p>
+      <w:r>
+        <w:rPr>
+          <w:rFonts w:hint="eastAsia"/>
+        </w:rPr>
+        <w:t xml:space="preserve">     분석 1] 게시글의 내용을 보는 기능을 가장 많이 사용할 것으로 보인다.</w:t>
+      </w:r>
+    </w:p>
+    <w:p>
+      <w:r>
+        <w:rPr>
+          <w:rFonts w:hint="eastAsia"/>
+        </w:rPr>
+        <w:t xml:space="preserve">     분석 2] 다음으로는 </w:t>
+      </w:r>
+      <w:r>
+        <w:t>“</w:t>
+      </w:r>
+      <w:r>
+        <w:rPr>
+          <w:rFonts w:hint="eastAsia"/>
+        </w:rPr>
+        <w:t xml:space="preserve">조회수 </w:t>
+      </w:r>
+      <w:proofErr w:type="spellStart"/>
+      <w:r>
+        <w:rPr>
+          <w:rFonts w:hint="eastAsia"/>
+        </w:rPr>
+        <w:t>전체게시글</w:t>
+      </w:r>
+      <w:proofErr w:type="spellEnd"/>
+      <w:r>
+        <w:rPr>
+          <w:rFonts w:hint="eastAsia"/>
+        </w:rPr>
+        <w:t xml:space="preserve"> </w:t>
+      </w:r>
+      <w:proofErr w:type="spellStart"/>
+      <w:r>
+        <w:rPr>
+          <w:rFonts w:hint="eastAsia"/>
+        </w:rPr>
+        <w:t>즐겨찾치</w:t>
+      </w:r>
+      <w:proofErr w:type="spellEnd"/>
+      <w:r>
+        <w:rPr>
+          <w:rFonts w:hint="eastAsia"/>
+        </w:rPr>
+        <w:t xml:space="preserve"> </w:t>
+      </w:r>
+      <w:proofErr w:type="spellStart"/>
+      <w:r>
+        <w:rPr>
+          <w:rFonts w:hint="eastAsia"/>
+        </w:rPr>
+        <w:t>내가작성한</w:t>
+      </w:r>
+      <w:proofErr w:type="spellEnd"/>
+      <w:r>
+        <w:rPr>
+          <w:rFonts w:hint="eastAsia"/>
+        </w:rPr>
+        <w:t xml:space="preserve"> 글</w:t>
+      </w:r>
+      <w:r>
+        <w:t>”</w:t>
+      </w:r>
+      <w:r>
+        <w:rPr>
+          <w:rFonts w:hint="eastAsia"/>
+        </w:rPr>
+        <w:t xml:space="preserve"> 기능 사용</w:t>
+      </w:r>
+    </w:p>
+    <w:p>
+      <w:r>
+        <w:rPr>
+          <w:rFonts w:hint="eastAsia"/>
+        </w:rPr>
+        <w:t xml:space="preserve">     분석 3] 다음으로는 맨 위에 있는 글의 검색 기능</w:t>
+      </w:r>
+    </w:p>
+    <w:p/>
+    <w:p/>
+    <w:p>
+      <w:r>
+        <w:t xml:space="preserve">단계 </w:t>
+      </w:r>
+      <w:r>
+        <w:rPr>
+          <w:b/>
+          <w:bCs/>
+        </w:rPr>
+        <w:t xml:space="preserve">2. Logical Thinking </w:t>
+      </w:r>
+    </w:p>
+    <w:p>
+      <w:r>
+        <w:t xml:space="preserve">게시판 기능을 기능 단위로 </w:t>
+      </w:r>
+      <w:proofErr w:type="spellStart"/>
+      <w:r>
+        <w:t>분해하시오</w:t>
+      </w:r>
+      <w:proofErr w:type="spellEnd"/>
+      <w:r>
+        <w:t xml:space="preserve">. </w:t>
+      </w:r>
+    </w:p>
+    <w:p>
+      <w:pPr>
+        <w:rPr>
+          <w:rFonts w:hint="eastAsia"/>
+        </w:rPr>
+      </w:pPr>
+      <w:r>
+        <w:t>목록 조회, 게시글 보기, 게시글 작성, 게시글 수정, 게시글 삭제</w:t>
+      </w:r>
+    </w:p>
     <w:sectPr>
       <w:pgSz w:w="11906" w:h="16838"/>
       <w:pgMar w:top="1701" w:right="1440" w:bottom="1440" w:left="1440" w:header="851" w:footer="992" w:gutter="0"/>
@@ -75,6 +588,127 @@
     </w:sectPr>
   </w:body>
 </w:document>
+</file>
+
+<file path=word/numbering.xml><?xml version="1.0" encoding="utf-8"?>
+<w:numbering xmlns:wpc="http://schemas.microsoft.com/office/word/2010/wordprocessingCanvas" xmlns:cx="http://schemas.microsoft.com/office/drawing/2014/chartex" xmlns:cx1="http://schemas.microsoft.com/office/drawing/2015/9/8/chartex" xmlns:cx2="http://schemas.microsoft.com/office/drawing/2015/10/21/chartex" xmlns:cx3="http://schemas.microsoft.com/office/drawing/2016/5/9/chartex" xmlns:cx4="http://schemas.microsoft.com/office/drawing/2016/5/10/chartex" xmlns:cx5="http://schemas.microsoft.com/office/drawing/2016/5/11/chartex" xmlns:cx6="http://schemas.microsoft.com/office/drawing/2016/5/12/chartex" xmlns:cx7="http://schemas.microsoft.com/office/drawing/2016/5/13/chartex" xmlns:cx8="http://schemas.microsoft.com/office/drawing/2016/5/14/chartex" xmlns:mc="http://schemas.openxmlformats.org/markup-compatibility/2006" xmlns:aink="http://schemas.microsoft.com/office/drawing/2016/ink" xmlns:am3d="http://schemas.microsoft.com/office/drawing/2017/model3d" xmlns:o="urn:schemas-microsoft-com:office:office" xmlns:oel="http://schemas.microsoft.com/office/2019/extlst" xmlns:r="http://schemas.openxmlformats.org/officeDocument/2006/relationships" xmlns:m="http://schemas.openxmlformats.org/officeDocument/2006/math" xmlns:v="urn:schemas-microsoft-com:vml" xmlns:wp14="http://schemas.microsoft.com/office/word/2010/wordprocessingDrawing" xmlns:wp="http://schemas.openxmlformats.org/drawingml/2006/wordprocessingDrawing" xmlns:w10="urn:schemas-microsoft-com:office:word" xmlns:w="http://schemas.openxmlformats.org/wordprocessingml/2006/main" xmlns:w14="http://schemas.microsoft.com/office/word/2010/wordml" xmlns:w15="http://schemas.microsoft.com/office/word/2012/wordml" xmlns:w16cex="http://schemas.microsoft.com/office/word/2018/wordml/cex" xmlns:w16cid="http://schemas.microsoft.com/office/word/2016/wordml/cid" xmlns:w16="http://schemas.microsoft.com/office/word/2018/wordml" xmlns:w16du="http://schemas.microsoft.com/office/word/2023/wordml/word16du" xmlns:w16sdtdh="http://schemas.microsoft.com/office/word/2020/wordml/sdtdatahash" xmlns:w16sdtfl="http://schemas.microsoft.com/office/word/2024/wordml/sdtformatlock" xmlns:w16se="http://schemas.microsoft.com/office/word/2015/wordml/symex" xmlns:wpg="http://schemas.microsoft.com/office/word/2010/wordprocessingGroup" xmlns:wpi="http://schemas.microsoft.com/office/word/2010/wordprocessingInk" xmlns:wne="http://schemas.microsoft.com/office/word/2006/wordml" xmlns:wps="http://schemas.microsoft.com/office/word/2010/wordprocessingShape" mc:Ignorable="w14 w15 w16se w16cid w16 w16cex w16sdtdh w16sdtfl w16du wp14">
+  <w:abstractNum w:abstractNumId="0" w15:restartNumberingAfterBreak="0">
+    <w:nsid w:val="225602AE"/>
+    <w:multiLevelType w:val="hybridMultilevel"/>
+    <w:tmpl w:val="38465702"/>
+    <w:lvl w:ilvl="0" w:tplc="72CC91A0">
+      <w:start w:val="3"/>
+      <w:numFmt w:val="bullet"/>
+      <w:lvlText w:val=""/>
+      <w:lvlJc w:val="left"/>
+      <w:pPr>
+        <w:ind w:left="1460" w:hanging="360"/>
+      </w:pPr>
+      <w:rPr>
+        <w:rFonts w:ascii="Wingdings" w:eastAsiaTheme="minorEastAsia" w:hAnsi="Wingdings" w:cstheme="minorBidi" w:hint="default"/>
+      </w:rPr>
+    </w:lvl>
+    <w:lvl w:ilvl="1" w:tplc="04090003" w:tentative="1">
+      <w:start w:val="1"/>
+      <w:numFmt w:val="bullet"/>
+      <w:lvlText w:val=""/>
+      <w:lvlJc w:val="left"/>
+      <w:pPr>
+        <w:ind w:left="1980" w:hanging="440"/>
+      </w:pPr>
+      <w:rPr>
+        <w:rFonts w:ascii="Wingdings" w:hAnsi="Wingdings" w:hint="default"/>
+      </w:rPr>
+    </w:lvl>
+    <w:lvl w:ilvl="2" w:tplc="04090005" w:tentative="1">
+      <w:start w:val="1"/>
+      <w:numFmt w:val="bullet"/>
+      <w:lvlText w:val=""/>
+      <w:lvlJc w:val="left"/>
+      <w:pPr>
+        <w:ind w:left="2420" w:hanging="440"/>
+      </w:pPr>
+      <w:rPr>
+        <w:rFonts w:ascii="Wingdings" w:hAnsi="Wingdings" w:hint="default"/>
+      </w:rPr>
+    </w:lvl>
+    <w:lvl w:ilvl="3" w:tplc="04090001" w:tentative="1">
+      <w:start w:val="1"/>
+      <w:numFmt w:val="bullet"/>
+      <w:lvlText w:val=""/>
+      <w:lvlJc w:val="left"/>
+      <w:pPr>
+        <w:ind w:left="2860" w:hanging="440"/>
+      </w:pPr>
+      <w:rPr>
+        <w:rFonts w:ascii="Wingdings" w:hAnsi="Wingdings" w:hint="default"/>
+      </w:rPr>
+    </w:lvl>
+    <w:lvl w:ilvl="4" w:tplc="04090003" w:tentative="1">
+      <w:start w:val="1"/>
+      <w:numFmt w:val="bullet"/>
+      <w:lvlText w:val=""/>
+      <w:lvlJc w:val="left"/>
+      <w:pPr>
+        <w:ind w:left="3300" w:hanging="440"/>
+      </w:pPr>
+      <w:rPr>
+        <w:rFonts w:ascii="Wingdings" w:hAnsi="Wingdings" w:hint="default"/>
+      </w:rPr>
+    </w:lvl>
+    <w:lvl w:ilvl="5" w:tplc="04090005" w:tentative="1">
+      <w:start w:val="1"/>
+      <w:numFmt w:val="bullet"/>
+      <w:lvlText w:val=""/>
+      <w:lvlJc w:val="left"/>
+      <w:pPr>
+        <w:ind w:left="3740" w:hanging="440"/>
+      </w:pPr>
+      <w:rPr>
+        <w:rFonts w:ascii="Wingdings" w:hAnsi="Wingdings" w:hint="default"/>
+      </w:rPr>
+    </w:lvl>
+    <w:lvl w:ilvl="6" w:tplc="04090001" w:tentative="1">
+      <w:start w:val="1"/>
+      <w:numFmt w:val="bullet"/>
+      <w:lvlText w:val=""/>
+      <w:lvlJc w:val="left"/>
+      <w:pPr>
+        <w:ind w:left="4180" w:hanging="440"/>
+      </w:pPr>
+      <w:rPr>
+        <w:rFonts w:ascii="Wingdings" w:hAnsi="Wingdings" w:hint="default"/>
+      </w:rPr>
+    </w:lvl>
+    <w:lvl w:ilvl="7" w:tplc="04090003" w:tentative="1">
+      <w:start w:val="1"/>
+      <w:numFmt w:val="bullet"/>
+      <w:lvlText w:val=""/>
+      <w:lvlJc w:val="left"/>
+      <w:pPr>
+        <w:ind w:left="4620" w:hanging="440"/>
+      </w:pPr>
+      <w:rPr>
+        <w:rFonts w:ascii="Wingdings" w:hAnsi="Wingdings" w:hint="default"/>
+      </w:rPr>
+    </w:lvl>
+    <w:lvl w:ilvl="8" w:tplc="04090005" w:tentative="1">
+      <w:start w:val="1"/>
+      <w:numFmt w:val="bullet"/>
+      <w:lvlText w:val=""/>
+      <w:lvlJc w:val="left"/>
+      <w:pPr>
+        <w:ind w:left="5060" w:hanging="440"/>
+      </w:pPr>
+      <w:rPr>
+        <w:rFonts w:ascii="Wingdings" w:hAnsi="Wingdings" w:hint="default"/>
+      </w:rPr>
+    </w:lvl>
+  </w:abstractNum>
+  <w:num w:numId="1" w16cid:durableId="1299338266">
+    <w:abstractNumId w:val="0"/>
+  </w:num>
+</w:numbering>
 </file>
 
 <file path=word/styles.xml><?xml version="1.0" encoding="utf-8"?>
@@ -684,7 +1318,6 @@
   <w:style w:type="character" w:default="1" w:styleId="a0">
     <w:name w:val="Default Paragraph Font"/>
     <w:uiPriority w:val="1"/>
-    <w:semiHidden/>
     <w:unhideWhenUsed/>
   </w:style>
   <w:style w:type="table" w:default="1" w:styleId="a1">

</xml_diff>